<commit_message>
Unificato 5V interfacce esterne aggiunto fusibile ripristinabile 50mA Inserito DC/DC 5V sia su HV che su VEXT
</commit_message>
<xml_diff>
--- a/ORCAD/Specifiche Per Il Routing.docx
+++ b/ORCAD/Specifiche Per Il Routing.docx
@@ -449,10 +449,10 @@
           <w:lang w:val="it-IT"/>
         </w:rPr>
         <w:drawing>
-          <wp:inline distT="0" distB="0" distL="0" distR="0" wp14:anchorId="5A2FC626" wp14:editId="24E53C4A">
-            <wp:extent cx="5934710" cy="5227320"/>
-            <wp:effectExtent l="0" t="0" r="8890" b="0"/>
-            <wp:docPr id="47118606" name="Immagine 1"/>
+          <wp:inline distT="0" distB="0" distL="0" distR="0" wp14:anchorId="6CE56459" wp14:editId="4F501617">
+            <wp:extent cx="5943600" cy="5969635"/>
+            <wp:effectExtent l="0" t="0" r="0" b="0"/>
+            <wp:docPr id="1909365922" name="Immagine 1"/>
             <wp:cNvGraphicFramePr>
               <a:graphicFrameLocks xmlns:a="http://schemas.openxmlformats.org/drawingml/2006/main" noChangeAspect="1"/>
             </wp:cNvGraphicFramePr>
@@ -481,7 +481,7 @@
                   <pic:spPr bwMode="auto">
                     <a:xfrm>
                       <a:off x="0" y="0"/>
-                      <a:ext cx="5934710" cy="5227320"/>
+                      <a:ext cx="5943600" cy="5969635"/>
                     </a:xfrm>
                     <a:prstGeom prst="rect">
                       <a:avLst/>

</xml_diff>